<commit_message>
Update research content and CV; improve mobile layout and image loading
</commit_message>
<xml_diff>
--- a/data/ChengruWu-CV.docx
+++ b/data/ChengruWu-CV.docx
@@ -1092,60 +1092,6 @@
                                 <w:bCs/>
                                 <w:sz w:val="20"/>
                                 <w:szCs w:val="21"/>
-                                <w:lang w:val="en-US" w:eastAsia="zh-CN"/>
-                              </w:rPr>
-                              <w:t>前5学期成绩</w:t>
-                            </w:r>
-                            <w:r>
-                              <w:rPr>
-                                <w:rFonts w:hint="eastAsia" w:ascii="华文楷体" w:hAnsi="华文楷体" w:eastAsia="华文楷体" w:cs="华文楷体"/>
-                                <w:b/>
-                                <w:bCs/>
-                                <w:sz w:val="20"/>
-                                <w:szCs w:val="21"/>
-                              </w:rPr>
-                              <w:t>：</w:t>
-                            </w:r>
-                            <w:r>
-                              <w:rPr>
-                                <w:rFonts w:hint="eastAsia" w:ascii="华文楷体" w:hAnsi="华文楷体" w:eastAsia="华文楷体" w:cs="华文楷体"/>
-                                <w:b/>
-                                <w:bCs/>
-                                <w:sz w:val="20"/>
-                                <w:szCs w:val="21"/>
-                                <w:lang w:val="en-US" w:eastAsia="zh-CN"/>
-                              </w:rPr>
-                              <w:t xml:space="preserve">GPA 3.88（1/97）                     </w:t>
-                            </w:r>
-                            <w:r>
-                              <w:rPr>
-                                <w:rFonts w:hint="eastAsia" w:ascii="华文楷体" w:hAnsi="华文楷体" w:eastAsia="华文楷体" w:cs="华文楷体"/>
-                                <w:b/>
-                                <w:bCs/>
-                                <w:sz w:val="16"/>
-                                <w:szCs w:val="18"/>
-                                <w:lang w:val="en-US" w:eastAsia="zh-CN"/>
-                              </w:rPr>
-                              <w:t xml:space="preserve">  </w:t>
-                            </w:r>
-                            <w:r>
-                              <w:rPr>
-                                <w:rFonts w:hint="eastAsia" w:ascii="华文楷体" w:hAnsi="华文楷体" w:eastAsia="华文楷体" w:cs="华文楷体"/>
-                                <w:b/>
-                                <w:bCs/>
-                                <w:sz w:val="16"/>
-                                <w:szCs w:val="18"/>
-                                <w:lang w:val="en-US" w:eastAsia="zh-CN"/>
-                              </w:rPr>
-                              <w:tab/>
-                            </w:r>
-                            <w:r>
-                              <w:rPr>
-                                <w:rFonts w:hint="eastAsia" w:ascii="华文楷体" w:hAnsi="华文楷体" w:eastAsia="华文楷体" w:cs="华文楷体"/>
-                                <w:b/>
-                                <w:bCs/>
-                                <w:sz w:val="20"/>
-                                <w:szCs w:val="21"/>
                               </w:rPr>
                               <w:t>外语水平：</w:t>
                             </w:r>
@@ -1536,60 +1482,6 @@
                           <w:lang w:val="en-US" w:eastAsia="zh-CN"/>
                         </w:rPr>
                       </w:pPr>
-                      <w:r>
-                        <w:rPr>
-                          <w:rFonts w:hint="eastAsia" w:ascii="华文楷体" w:hAnsi="华文楷体" w:eastAsia="华文楷体" w:cs="华文楷体"/>
-                          <w:b/>
-                          <w:bCs/>
-                          <w:sz w:val="20"/>
-                          <w:szCs w:val="21"/>
-                          <w:lang w:val="en-US" w:eastAsia="zh-CN"/>
-                        </w:rPr>
-                        <w:t>前5学期成绩</w:t>
-                      </w:r>
-                      <w:r>
-                        <w:rPr>
-                          <w:rFonts w:hint="eastAsia" w:ascii="华文楷体" w:hAnsi="华文楷体" w:eastAsia="华文楷体" w:cs="华文楷体"/>
-                          <w:b/>
-                          <w:bCs/>
-                          <w:sz w:val="20"/>
-                          <w:szCs w:val="21"/>
-                        </w:rPr>
-                        <w:t>：</w:t>
-                      </w:r>
-                      <w:r>
-                        <w:rPr>
-                          <w:rFonts w:hint="eastAsia" w:ascii="华文楷体" w:hAnsi="华文楷体" w:eastAsia="华文楷体" w:cs="华文楷体"/>
-                          <w:b/>
-                          <w:bCs/>
-                          <w:sz w:val="20"/>
-                          <w:szCs w:val="21"/>
-                          <w:lang w:val="en-US" w:eastAsia="zh-CN"/>
-                        </w:rPr>
-                        <w:t xml:space="preserve">GPA 3.88（1/97）                     </w:t>
-                      </w:r>
-                      <w:r>
-                        <w:rPr>
-                          <w:rFonts w:hint="eastAsia" w:ascii="华文楷体" w:hAnsi="华文楷体" w:eastAsia="华文楷体" w:cs="华文楷体"/>
-                          <w:b/>
-                          <w:bCs/>
-                          <w:sz w:val="16"/>
-                          <w:szCs w:val="18"/>
-                          <w:lang w:val="en-US" w:eastAsia="zh-CN"/>
-                        </w:rPr>
-                        <w:t xml:space="preserve">  </w:t>
-                      </w:r>
-                      <w:r>
-                        <w:rPr>
-                          <w:rFonts w:hint="eastAsia" w:ascii="华文楷体" w:hAnsi="华文楷体" w:eastAsia="华文楷体" w:cs="华文楷体"/>
-                          <w:b/>
-                          <w:bCs/>
-                          <w:sz w:val="16"/>
-                          <w:szCs w:val="18"/>
-                          <w:lang w:val="en-US" w:eastAsia="zh-CN"/>
-                        </w:rPr>
-                        <w:tab/>
-                      </w:r>
                       <w:r>
                         <w:rPr>
                           <w:rFonts w:hint="eastAsia" w:ascii="华文楷体" w:hAnsi="华文楷体" w:eastAsia="华文楷体" w:cs="华文楷体"/>
@@ -3009,7 +2901,7 @@
                                 <w:szCs w:val="20"/>
                                 <w:lang w:val="en-US" w:eastAsia="zh-CN"/>
                               </w:rPr>
-                              <w:t>CangjieBench: Benchmarking LLMs on a Low-Resource General-Purpose Programming Language</w:t>
+                              <w:t>Can LLM Coding Assistants Support Emerging Programming Languages? An Empirical Study on Cangjie</w:t>
                             </w:r>
                           </w:p>
                           <w:p>
@@ -3048,7 +2940,7 @@
                                 <w:szCs w:val="21"/>
                                 <w:lang w:val="en-US" w:eastAsia="zh-CN"/>
                               </w:rPr>
-                              <w:t>针对低资源通用编程语言缺乏系统评测的问题，构建了无污染的仓颉语言基准 CangjieBench。并在直接生成、语法约束、RAG 和智能体四种设置下系统评测主流大模型。</w:t>
+                              <w:t>构建含 248 道任务的仓颉语言基准 CangjieBench，评测六个大模型在直接提示、语法约束提示、文档检索、代码检索和智能体五种方法下的表现，比较生成准确率、编译率与 token 成本。</w:t>
                             </w:r>
                           </w:p>
                           <w:p>
@@ -4529,7 +4421,7 @@
                           <w:szCs w:val="20"/>
                           <w:lang w:val="en-US" w:eastAsia="zh-CN"/>
                         </w:rPr>
-                        <w:t>CangjieBench: Benchmarking LLMs on a Low-Resource General-Purpose Programming Language</w:t>
+                        <w:t>Can LLM Coding Assistants Support Emerging Programming Languages? An Empirical Study on Cangjie</w:t>
                       </w:r>
                     </w:p>
                     <w:p>
@@ -4568,7 +4460,7 @@
                           <w:szCs w:val="21"/>
                           <w:lang w:val="en-US" w:eastAsia="zh-CN"/>
                         </w:rPr>
-                        <w:t>针对低资源通用编程语言缺乏系统评测的问题，构建了无污染的仓颉语言基准 CangjieBench。并在直接生成、语法约束、RAG 和智能体四种设置下系统评测主流大模型。</w:t>
+                        <w:t>构建含 248 道任务的仓颉语言基准 CangjieBench，评测六个大模型在直接提示、语法约束提示、文档检索、代码检索和智能体五种方法下的表现，比较生成准确率、编译率与 token 成本。</w:t>
                       </w:r>
                     </w:p>
                     <w:p>

</xml_diff>